<commit_message>
refactor(audit): final econometric closure, sync presidential corpus, remove python and duplicate files
- Consolidate full econometric inference exclusively around @petrogustavo presidential communication (VAR, Granger, GARCH, DCC-GARCH, Markov Switching, Event Study).
- Restrict opinion corpus strictly to descriptive EDA, lexical topics, and extraction bias documentation.
- Synchronize Granger causality family to 112 presidential tests (5 nominal, 0 FDR) and archive historic comparison.
- Implement VAR(3) robustness table (var_robustez_rezagos.csv/.html) comparing parsimonious VAR(1) vs VAR(3).
- Eradicate hardcoded obsolete figures and ensure non-causal language across paper, notebook, and tables.
- Remove all Python scripts, old review snapshots, duplicate figures (paper/español/figures), and duplicate data files.
</commit_message>
<xml_diff>
--- a/paper/español/quarto-tandf.docx
+++ b/paper/español/quarto-tandf.docx
@@ -99,32 +99,94 @@
         <w:pStyle w:val="BodyText"/>
       </w:pPr>
       <w:r>
-        <w:t xml:space="preserve">Este artículo examina la relación observacional entre la comunicación emitida por la cuenta presidencial</w:t>
-      </w:r>
-      <w:r>
-        <w:t xml:space="preserve"> </w:t>
-      </w:r>
-      <w:r>
-        <w:t xml:space="preserve">(</w:t>
-      </w:r>
-      <w:hyperlink w:anchor="ref-petrogustavo">
-        <w:r>
-          <w:rPr>
-            <w:rStyle w:val="Hyperlink"/>
-            <w:b/>
-            <w:bCs/>
-          </w:rPr>
-          <w:t xml:space="preserve">petrogustavo?</w:t>
-        </w:r>
-      </w:hyperlink>
-      <w:r>
-        <w:t xml:space="preserve">)</w:t>
-      </w:r>
-      <w:r>
-        <w:t xml:space="preserve"> </w:t>
-      </w:r>
-      <w:r>
-        <w:t xml:space="preserve">y cuatro mercados financieros en Colombia durante el periodo 2022-2026. A partir de 14.659 publicaciones presidenciales y una muestra secundaria de 13.648 mensajes recuperados sobre Gustavo Petro, se construyen señales diarias de intensidad, sentimiento léxico, polaridad neta e Índice de Presión Informacional (IPI) presidencial. La auditoría metodológica documenta que el corpus de consulta pública presenta un sesgo crítico de recolección (97,49 % concentrado a las 18:00 y 95,77 % de días con cupo fijo de 10 tweets), lo que invalida su uso para dinámica temporal e inferencia bursátil, preservándolo exclusivamente para análisis descriptivos secundarios. La alineación temporal asocia cada intervalo discursivo con la siguiente sesión observada de mercado, consolidando 934 sesiones únicas y 882 observaciones completas para el sistema econométrico multivariado (TRM, COLCAP, tasas TES y precio spot de energía XM). Las pruebas de precedencia de Granger arrojan 5 rechazos nominales de 112 en la familia temática presidencial (12 de 208 en el total auditado) y ninguno tras controlar la tasa de falsos descubrimientos (FDR). El modelo DCC-GARCH multivariado estima un parámetro de reacción no significativo (a = 0,0119; p = 0,069) y correlaciones condicionales dinámicas medias pequeñas (-0,0430 a +0,0574). Un modelo Markov-Switching identifica dos regímenes de dispersión condicional IPI-TRM. Los resultados delimitan la ausencia de contenido predictivo lineal robusto a escala diaria y descartan efectos causales directos del discurso presidencial sobre las cotizaciones financieras.</w:t>
+        <w:t xml:space="preserve">Este artículo examina la relación observacional entre la comunicación emitida por la cuenta presidencial @petrogustavo y cuatro mercados financieros en Colombia durante el periodo 2022-2026. A partir de 14.659 publicaciones presidenciales y una muestra secundaria de 13.648 mensajes recuperados sobre Gustavo Petro (preservada exclusivamente para análisis descriptivos secundarios y auditoría de sesgo de extracción), se construyen señales diarias de intensidad, sentimiento léxico, polaridad neta e Índice de Presión Informacional (IPI) presidencial. La alineación temporal asocia cada intervalo discursivo con la siguiente sesión observada de mercado, consolidando 934 sesiones únicas, 882 observaciones completas para el sistema multivariado y 881 observaciones efectivas en el modelo VAR. Las pruebas de precedencia predictiva de Granger, evaluadas estrictamente sobre la familia presidencial de 112 contrastes (cuatro respuestas bursátiles × siete señales discursivas × cuatro rezagos), arrojan 5 rechazos nominales con</w:t>
+      </w:r>
+      <w:r>
+        <w:t xml:space="preserve"> </w:t>
+      </w:r>
+      <m:oMath>
+        <m:r>
+          <m:t>p</m:t>
+        </m:r>
+        <m:r>
+          <m:rPr>
+            <m:sty m:val="p"/>
+          </m:rPr>
+          <m:t>&lt;</m:t>
+        </m:r>
+        <m:r>
+          <m:t>0</m:t>
+        </m:r>
+        <m:r>
+          <m:rPr>
+            <m:sty m:val="p"/>
+          </m:rPr>
+          <m:t>,</m:t>
+        </m:r>
+        <m:r>
+          <m:t>05</m:t>
+        </m:r>
+      </m:oMath>
+      <w:r>
+        <w:t xml:space="preserve"> </w:t>
+      </w:r>
+      <w:r>
+        <w:t xml:space="preserve">(concentrados en polaridad y alegría frente a la TRM) y ninguno tras controlar la tasa de falsos descubrimientos (FDR) mediante Benjamini-Hochberg; el IPI presidencial no presenta ningún rechazo nominal. El modelo DCC-GARCH multivariado estima un parámetro de reacción no significativo al 5 % (</w:t>
+      </w:r>
+      <m:oMath>
+        <m:r>
+          <m:t>a</m:t>
+        </m:r>
+        <m:r>
+          <m:rPr>
+            <m:sty m:val="p"/>
+          </m:rPr>
+          <m:t>=</m:t>
+        </m:r>
+        <m:r>
+          <m:t>0</m:t>
+        </m:r>
+        <m:r>
+          <m:rPr>
+            <m:sty m:val="p"/>
+          </m:rPr>
+          <m:t>,</m:t>
+        </m:r>
+        <m:r>
+          <m:t>0119</m:t>
+        </m:r>
+      </m:oMath>
+      <w:r>
+        <w:t xml:space="preserve">;</w:t>
+      </w:r>
+      <w:r>
+        <w:t xml:space="preserve"> </w:t>
+      </w:r>
+      <m:oMath>
+        <m:r>
+          <m:t>p</m:t>
+        </m:r>
+        <m:r>
+          <m:rPr>
+            <m:sty m:val="p"/>
+          </m:rPr>
+          <m:t>=</m:t>
+        </m:r>
+        <m:r>
+          <m:t>0</m:t>
+        </m:r>
+        <m:r>
+          <m:rPr>
+            <m:sty m:val="p"/>
+          </m:rPr>
+          <m:t>,</m:t>
+        </m:r>
+        <m:r>
+          <m:t>069</m:t>
+        </m:r>
+      </m:oMath>
+      <w:r>
+        <w:t xml:space="preserve">) y correlaciones condicionales dinámicas medias pequeñas (-0,0430 a +0,0574). Un modelo Markov-Switching identifica dos regímenes estadísticos de dispersión condicional IPI-TRM. Los resultados delimitan la ausencia de contenido predictivo lineal sistemático bajo las especificaciones diarias analizadas; el diseño observacional no estima efectos causales ni permite establecer transmisión causal entre el discurso presidencial y las cotizaciones financieras.</w:t>
       </w:r>
     </w:p>
     <w:p>
@@ -162,32 +224,67 @@
         <w:pStyle w:val="BodyText"/>
       </w:pPr>
       <w:r>
-        <w:t xml:space="preserve">This article examines the observational relationship between presidential communication from the</w:t>
-      </w:r>
-      <w:r>
-        <w:t xml:space="preserve"> </w:t>
-      </w:r>
-      <w:r>
-        <w:t xml:space="preserve">(</w:t>
-      </w:r>
-      <w:hyperlink w:anchor="ref-petrogustavo">
-        <w:r>
-          <w:rPr>
-            <w:rStyle w:val="Hyperlink"/>
-            <w:b/>
-            <w:bCs/>
-          </w:rPr>
-          <w:t xml:space="preserve">petrogustavo?</w:t>
-        </w:r>
-      </w:hyperlink>
-      <w:r>
-        <w:t xml:space="preserve">)</w:t>
-      </w:r>
-      <w:r>
-        <w:t xml:space="preserve"> </w:t>
-      </w:r>
-      <w:r>
-        <w:t xml:space="preserve">account and four Colombian financial markets from 2022 to 2026. Based on 14,659 presidential posts and a secondary sample of 13,648 public posts retrieved about Gustavo Petro, we construct daily signals of communicative intensity, lexical sentiment, net polarity, and a presidential Informational Pressure Index (IPI). Methodological audits demonstrate that the public query corpus exhibits severe collection bias (97.49% concentrated at 18:00 local time and 95.77% of days restricted by a fixed extraction cap of 10 tweets), invalidating its temporal dynamics for financial econometric inference and retaining it solely for secondary descriptive comparisons. Temporal alignment maps each discursive interval to the next observed trading session, yielding 934 unique response sessions and 882 complete cases for the multivariate econometric system (official exchange rate, COLCAP equity index, sovereign TES yields, and electricity spot prices). Granger predictive precedence tests yield 5 nominal rejections out of 112 in the presidential thematic family (12 out of 208 total) and zero surviving Benjamini-Hochberg false discovery rate (FDR) adjustment. Multivariate DCC-GARCH estimation reveals a statistically insignificant news reaction parameter (a = 0.0119; p = 0.069) and small mean dynamic conditional correlations (-0.0430 to +0.0574). A Markov-Switching model identifies two persistent conditional volatility regimes. These findings establish the absence of robust linear predictive content at daily frequency and rule out direct causal transmission from presidential communication to Colombian financial markets.</w:t>
+        <w:t xml:space="preserve">This article examines the observational relationship between presidential communication from the @petrogustavo account and four Colombian financial markets from 2022 to 2026. Based on 14,659 presidential posts and a secondary sample of 13,648 public posts retrieved about Gustavo Petro (retained solely for secondary descriptive comparisons and extraction bias auditing), we construct daily signals of communicative intensity, lexical sentiment, net polarity, and a presidential Informational Pressure Index (IPI). Temporal alignment maps each discursive interval to the next observed trading session, yielding 934 unique response sessions, 882 complete cases for multivariate modeling, and 881 effective observations in the VAR system. Granger predictive precedence tests, evaluated strictly on the presidential family of 112 tests (four financial responses × seven discursive signals × four lags), yield 5 nominal rejections with</w:t>
+      </w:r>
+      <w:r>
+        <w:t xml:space="preserve"> </w:t>
+      </w:r>
+      <m:oMath>
+        <m:r>
+          <m:t>p</m:t>
+        </m:r>
+        <m:r>
+          <m:rPr>
+            <m:sty m:val="p"/>
+          </m:rPr>
+          <m:t>&lt;</m:t>
+        </m:r>
+        <m:r>
+          <m:t>0.05</m:t>
+        </m:r>
+      </m:oMath>
+      <w:r>
+        <w:t xml:space="preserve"> </w:t>
+      </w:r>
+      <w:r>
+        <w:t xml:space="preserve">(concentrated in polarity and joy predicting the exchange rate) and zero surviving Benjamini-Hochberg false discovery rate (FDR) adjustment; presidential IPI yields zero nominal rejections. Multivariate DCC-GARCH estimation reveals a news reaction parameter that is not statistically significant at the 5% level (</w:t>
+      </w:r>
+      <m:oMath>
+        <m:r>
+          <m:t>a</m:t>
+        </m:r>
+        <m:r>
+          <m:rPr>
+            <m:sty m:val="p"/>
+          </m:rPr>
+          <m:t>=</m:t>
+        </m:r>
+        <m:r>
+          <m:t>0.0119</m:t>
+        </m:r>
+      </m:oMath>
+      <w:r>
+        <w:t xml:space="preserve">;</w:t>
+      </w:r>
+      <w:r>
+        <w:t xml:space="preserve"> </w:t>
+      </w:r>
+      <m:oMath>
+        <m:r>
+          <m:t>p</m:t>
+        </m:r>
+        <m:r>
+          <m:rPr>
+            <m:sty m:val="p"/>
+          </m:rPr>
+          <m:t>=</m:t>
+        </m:r>
+        <m:r>
+          <m:t>0.069</m:t>
+        </m:r>
+      </m:oMath>
+      <w:r>
+        <w:t xml:space="preserve">) and small mean dynamic conditional correlations (-0.0430 to +0.0574). A Markov-Switching model identifies two statistical regimes of conditional dispersion. These findings establish the absence of systematic linear predictive content at daily frequency; the observational design does not estimate causal effects nor demonstrate direct causal transmission from presidential communication to Colombian financial markets.</w:t>
       </w:r>
     </w:p>
     <w:p>
@@ -882,7 +979,7 @@
         <w:rPr>
           <w:rStyle w:val="VerbatimChar"/>
         </w:rPr>
-        <w:t xml:space="preserve">"Gustavo Petro" OR @petrogustavo</w:t>
+        <w:t xml:space="preserve">"Gustavo Petro" OR \@petrogustavo</w:t>
       </w:r>
       <w:r>
         <w:t xml:space="preserve">, restringe el idioma a español y excluye retuits, respuestas, citas y publicaciones con enlaces. Su función reparte un objetivo mensual en cupos por día, pagina hasta alcanzar el cupo o agotar los resultados y deduplica identificadores. La consulta especifica intervalos diarios en UTC, mientras que la fecha de análisis se calcula después en Bogotá. No se conservan registros de ejecución para probar que todos los archivos históricos se obtuvieron con la misma versión del script o en idénticas condiciones de acceso a la API. Por eso, el conteo de</w:t>
@@ -3904,7 +4001,7 @@
                     <a:graphicData uri="http://schemas.openxmlformats.org/drawingml/2006/picture">
                       <pic:pic>
                         <pic:nvPicPr>
-                          <pic:cNvPr descr="figures/comparacion_corpus_volumen.png" id="44" name="Picture"/>
+                          <pic:cNvPr descr="../../output/figures/español/comparacion_corpus_volumen.png" id="44" name="Picture"/>
                           <pic:cNvPicPr>
                             <a:picLocks noChangeArrowheads="1" noChangeAspect="1"/>
                           </pic:cNvPicPr>
@@ -4112,7 +4209,7 @@
                     <a:graphicData uri="http://schemas.openxmlformats.org/drawingml/2006/picture">
                       <pic:pic>
                         <pic:nvPicPr>
-                          <pic:cNvPr descr="figures/temas_reforma_resumen.png" id="49" name="Picture"/>
+                          <pic:cNvPr descr="../../output/figures/español/temas_reforma_resumen.png" id="49" name="Picture"/>
                           <pic:cNvPicPr>
                             <a:picLocks noChangeArrowheads="1" noChangeAspect="1"/>
                           </pic:cNvPicPr>
@@ -4331,7 +4428,7 @@
                     <a:graphicData uri="http://schemas.openxmlformats.org/drawingml/2006/picture">
                       <pic:pic>
                         <pic:nvPicPr>
-                          <pic:cNvPr descr="figures/ipi_serie_diaria.png" id="53" name="Picture"/>
+                          <pic:cNvPr descr="../../output/figures/español/ipi_serie_diaria.png" id="53" name="Picture"/>
                           <pic:cNvPicPr>
                             <a:picLocks noChangeArrowheads="1" noChangeAspect="1"/>
                           </pic:cNvPicPr>
@@ -4396,29 +4493,7 @@
         <w:t xml:space="preserve"> </w:t>
       </w:r>
       <w:r>
-        <w:t xml:space="preserve">Fuente: cuaderno reproducible, figura regenerada desde el IPI presidencial diario. El índice multiplica tono medio y logaritmo del número de publicaciones de</w:t>
-      </w:r>
-      <w:r>
-        <w:t xml:space="preserve"> </w:t>
-      </w:r>
-      <w:r>
-        <w:t xml:space="preserve">(</w:t>
-      </w:r>
-      <w:hyperlink w:anchor="ref-petrogustavo">
-        <w:r>
-          <w:rPr>
-            <w:rStyle w:val="Hyperlink"/>
-            <w:b/>
-            <w:bCs/>
-          </w:rPr>
-          <w:t xml:space="preserve">petrogustavo?</w:t>
-        </w:r>
-      </w:hyperlink>
-      <w:r>
-        <w:t xml:space="preserve">)</w:t>
-      </w:r>
-      <w:r>
-        <w:t xml:space="preserve">, ambos estandarizados en ese universo. Su signo no equivale al signo del tono.</w:t>
+        <w:t xml:space="preserve">Fuente: cuaderno reproducible, figura regenerada desde el IPI presidencial diario. El índice multiplica tono medio y logaritmo del número de publicaciones de @petrogustavo, ambos estandarizados en ese universo. Su signo no equivale al signo del tono.</w:t>
       </w:r>
     </w:p>
     <w:bookmarkEnd w:id="55"/>
@@ -4853,7 +4928,16 @@
         <w:pStyle w:val="BodyText"/>
       </w:pPr>
       <w:r>
-        <w:t xml:space="preserve">El VAR con un rezago conserva la especificación previa. Su raíz de mayor módulo es 0,281, dentro de la región de estabilidad, pero la selección de orden es ambigua: HQ y SC prefieren uno, AIC y FPE prefieren dos. Más importante para la inferencia, el Portmanteau rechaza ausencia de autocorrelación residual (</w:t>
+        <w:t xml:space="preserve">El VAR con un rezago conserva la especificación previa. Su raíz de mayor módulo es 0,281, dentro de la región de estabilidad. Los criterios de selección de rezagos no son unánimes: HQ y SC/BIC favorecen un VAR(1), mientras AIC y FPE favorecen un VAR(3). Se conserva el VAR(1) como especificación principal parsimoniosa justificada en HQ y SC, y se evalúa el VAR(3) como sensibilidad y robustez (</w:t>
+      </w:r>
+      <w:r>
+        <w:rPr>
+          <w:rStyle w:val="VerbatimChar"/>
+        </w:rPr>
+        <w:t xml:space="preserve">var_robustez_rezagos.csv</w:t>
+      </w:r>
+      <w:r>
+        <w:t xml:space="preserve">), donde la raíz máxima pasa a 0,695 (estable) pero persisten el rechazo de autocorrelación residual y no normalidad sin alterar las conclusiones cualitativas sobre los coeficientes discursivos. Más importante para la inferencia, en el VAR(1) el Portmanteau rechaza ausencia de autocorrelación residual (</w:t>
       </w:r>
       <m:oMath>
         <m:r>
@@ -6130,29 +6214,7 @@
         <w:t xml:space="preserve"> </w:t>
       </w:r>
       <w:r>
-        <w:t xml:space="preserve">la polaridad de</w:t>
-      </w:r>
-      <w:r>
-        <w:t xml:space="preserve"> </w:t>
-      </w:r>
-      <w:r>
-        <w:t xml:space="preserve">(</w:t>
-      </w:r>
-      <w:hyperlink w:anchor="ref-petrogustavo">
-        <w:r>
-          <w:rPr>
-            <w:rStyle w:val="Hyperlink"/>
-            <w:b/>
-            <w:bCs/>
-          </w:rPr>
-          <w:t xml:space="preserve">petrogustavo?</w:t>
-        </w:r>
-      </w:hyperlink>
-      <w:r>
-        <w:t xml:space="preserve">)</w:t>
-      </w:r>
-      <w:r>
-        <w:t xml:space="preserve">,</w:t>
+        <w:t xml:space="preserve">la polaridad de @petrogustavo,</w:t>
       </w:r>
       <w:r>
         <w:t xml:space="preserve"> </w:t>
@@ -6297,26 +6359,7 @@
         <w:pStyle w:val="FirstParagraph"/>
       </w:pPr>
       <w:r>
-        <w:t xml:space="preserve">La familia de 112 contrastes de Granger de la serie temática de comunicación presidencial (</w:t>
-      </w:r>
-      <w:r>
-        <w:t xml:space="preserve">(</w:t>
-      </w:r>
-      <w:hyperlink w:anchor="ref-petrogustavo">
-        <w:r>
-          <w:rPr>
-            <w:rStyle w:val="Hyperlink"/>
-            <w:b/>
-            <w:bCs/>
-          </w:rPr>
-          <w:t xml:space="preserve">petrogustavo?</w:t>
-        </w:r>
-      </w:hyperlink>
-      <w:r>
-        <w:t xml:space="preserve">)</w:t>
-      </w:r>
-      <w:r>
-        <w:t xml:space="preserve">) reúne cuatro respuestas bursátiles, siete predictores textuales (IPI, polaridad y cinco emociones NRC estandarizadas) y rezagos de una a cuatro sesiones. Cinco valores</w:t>
+        <w:t xml:space="preserve">La familia de 112 contrastes de Granger de la serie temática de comunicación presidencial (@petrogustavo) reúne cuatro respuestas bursátiles, siete predictores textuales (IPI, polaridad y cinco emociones NRC estandarizadas) y rezagos de una a cuatro sesiones. Cinco valores</w:t>
       </w:r>
       <w:r>
         <w:t xml:space="preserve"> </w:t>
@@ -6484,50 +6527,7 @@
         </m:r>
       </m:oMath>
       <w:r>
-        <w:t xml:space="preserve">). En particular, el IPI presidencial no presenta ningún rechazo nominal frente a los activos financieros. La comparación por corpus tiene otras 96 pruebas: dos corpus, cuatro respuestas, tres predictores y cuatro rezagos. Allí siete</w:t>
-      </w:r>
-      <w:r>
-        <w:t xml:space="preserve"> </w:t>
-      </w:r>
-      <m:oMath>
-        <m:r>
-          <m:t>p</m:t>
-        </m:r>
-      </m:oMath>
-      <w:r>
-        <w:t xml:space="preserve"> </w:t>
-      </w:r>
-      <w:r>
-        <w:t xml:space="preserve">son nominalmente menores de 0,05 (cinco en la cuenta presidencial y dos en opinión) y ninguno supera la corrección (</w:t>
-      </w:r>
-      <m:oMath>
-        <m:r>
-          <m:t>q</m:t>
-        </m:r>
-        <m:r>
-          <m:rPr>
-            <m:sty m:val="p"/>
-          </m:rPr>
-          <m:t>≥</m:t>
-        </m:r>
-        <m:r>
-          <m:t>0</m:t>
-        </m:r>
-        <m:r>
-          <m:rPr>
-            <m:sty m:val="p"/>
-          </m:rPr>
-          <m:t>,</m:t>
-        </m:r>
-        <m:r>
-          <m:t>475</m:t>
-        </m:r>
-      </m:oMath>
-      <w:r>
-        <w:t xml:space="preserve">).</w:t>
-      </w:r>
-      <w:r>
-        <w:t xml:space="preserve"> </w:t>
+        <w:t xml:space="preserve">). En particular, el IPI presidencial no presenta ningún rechazo nominal frente a los activos financieros (</w:t>
       </w:r>
       <w:hyperlink w:anchor="tbl-granger">
         <w:r>
@@ -6538,24 +6538,7 @@
         </w:r>
       </w:hyperlink>
       <w:r>
-        <w:t xml:space="preserve"> </w:t>
-      </w:r>
-      <w:r>
-        <w:t xml:space="preserve">conserva la separación de familias del código. Agregarlas después en una única familia o dividirlas en grupos más favorables cambiaría los</w:t>
-      </w:r>
-      <w:r>
-        <w:t xml:space="preserve"> </w:t>
-      </w:r>
-      <m:oMath>
-        <m:r>
-          <m:t>q</m:t>
-        </m:r>
-      </m:oMath>
-      <w:r>
-        <w:t xml:space="preserve"> </w:t>
-      </w:r>
-      <w:r>
-        <w:t xml:space="preserve">y no forma parte de esta especificación.</w:t>
+        <w:t xml:space="preserve">). No se incorporan pruebas de universos secundarios a la familia inferencial principal.</w:t>
       </w:r>
     </w:p>
     <w:tbl>
@@ -6582,7 +6565,7 @@
               <w:pStyle w:val="ImageCaption"/>
             </w:pPr>
             <w:r>
-              <w:t xml:space="preserve">Tabla 5: Precedencia predictiva de Granger y control de comparaciones múltiples. Fuente:</w:t>
+              <w:t xml:space="preserve">Tabla 5: Precedencia predictiva de Granger y control de comparaciones múltiples en la familia presidencial. Fuente:</w:t>
             </w:r>
             <w:r>
               <w:t xml:space="preserve"> </w:t>
@@ -6597,7 +6580,7 @@
               <w:t xml:space="preserve"> </w:t>
             </w:r>
             <w:r>
-              <w:t xml:space="preserve">regenerado; las flechas representan la dirección de la prueba lineal condicionada a rezagos, no causalidad identificada.</w:t>
+              <w:t xml:space="preserve">regenerado; cuatro respuestas bursátiles, siete señales discursivas presidenciales y rezagos de 1 a 4 sesiones. Las flechas representan la dirección evaluada en la prueba lineal condicionada a rezagos, no causalidad identificada.</w:t>
             </w:r>
           </w:p>
           <w:tbl>
@@ -6627,7 +6610,7 @@
                     <w:jc w:val="center"/>
                   </w:pPr>
                   <w:r>
-                    <w:t xml:space="preserve">Familia FDR predefinida</w:t>
+                    <w:t xml:space="preserve">Subconjunto discursivo</w:t>
                   </w:r>
                 </w:p>
               </w:tc>
@@ -6759,26 +6742,11 @@
                     <w:jc w:val="center"/>
                   </w:pPr>
                   <w:r>
-                    <w:t xml:space="preserve">Señales discursivas presidenciales (</w:t>
-                  </w:r>
-                  <w:r>
-                    <w:t xml:space="preserve">(</w:t>
-                  </w:r>
-                  <w:hyperlink w:anchor="ref-petrogustavo">
-                    <w:r>
-                      <w:rPr>
-                        <w:rStyle w:val="Hyperlink"/>
-                        <w:b/>
-                        <w:bCs/>
-                      </w:rPr>
-                      <w:t xml:space="preserve">petrogustavo?</w:t>
-                    </w:r>
-                  </w:hyperlink>
-                  <w:r>
-                    <w:t xml:space="preserve">)</w:t>
-                  </w:r>
-                  <w:r>
-                    <w:t xml:space="preserve">)</w:t>
+                    <w:rPr>
+                      <w:b/>
+                      <w:bCs/>
+                    </w:rPr>
+                    <w:t xml:space="preserve">Familia presidencial completa (@petrogustavo)</w:t>
                   </w:r>
                 </w:p>
               </w:tc>
@@ -6791,6 +6759,10 @@
                     <w:jc w:val="center"/>
                   </w:pPr>
                   <w:r>
+                    <w:rPr>
+                      <w:b/>
+                      <w:bCs/>
+                    </w:rPr>
                     <w:t xml:space="preserve">112</w:t>
                   </w:r>
                 </w:p>
@@ -6804,7 +6776,82 @@
                     <w:jc w:val="center"/>
                   </w:pPr>
                   <w:r>
+                    <w:rPr>
+                      <w:b/>
+                      <w:bCs/>
+                    </w:rPr>
                     <w:t xml:space="preserve">5</w:t>
+                  </w:r>
+                </w:p>
+              </w:tc>
+              <w:tc>
+                <w:tcPr/>
+                <w:p>
+                  <w:pPr>
+                    <w:pStyle w:val="Compact"/>
+                    <w:jc w:val="right"/>
+                    <w:jc w:val="center"/>
+                  </w:pPr>
+                  <w:r>
+                    <w:rPr>
+                      <w:b/>
+                      <w:bCs/>
+                    </w:rPr>
+                    <w:t xml:space="preserve">0</w:t>
+                  </w:r>
+                </w:p>
+              </w:tc>
+              <w:tc>
+                <w:tcPr/>
+                <w:p>
+                  <w:pPr>
+                    <w:pStyle w:val="Compact"/>
+                    <w:jc w:val="left"/>
+                    <w:jc w:val="center"/>
+                  </w:pPr>
+                  <w:r>
+                    <w:t xml:space="preserve">Polaridad → TRM, rezago 1: 0,00747; 0,791.</w:t>
+                  </w:r>
+                </w:p>
+              </w:tc>
+            </w:tr>
+            <w:tr>
+              <w:tc>
+                <w:tcPr/>
+                <w:p>
+                  <w:pPr>
+                    <w:pStyle w:val="Compact"/>
+                    <w:jc w:val="left"/>
+                    <w:jc w:val="center"/>
+                  </w:pPr>
+                  <w:r>
+                    <w:t xml:space="preserve">Polaridad neta diaria</w:t>
+                  </w:r>
+                </w:p>
+              </w:tc>
+              <w:tc>
+                <w:tcPr/>
+                <w:p>
+                  <w:pPr>
+                    <w:pStyle w:val="Compact"/>
+                    <w:jc w:val="right"/>
+                    <w:jc w:val="center"/>
+                  </w:pPr>
+                  <w:r>
+                    <w:t xml:space="preserve">16</w:t>
+                  </w:r>
+                </w:p>
+              </w:tc>
+              <w:tc>
+                <w:tcPr/>
+                <w:p>
+                  <w:pPr>
+                    <w:pStyle w:val="Compact"/>
+                    <w:jc w:val="right"/>
+                    <w:jc w:val="center"/>
+                  </w:pPr>
+                  <w:r>
+                    <w:t xml:space="preserve">4</w:t>
                   </w:r>
                 </w:p>
               </w:tc>
@@ -6845,7 +6892,7 @@
                     <w:jc w:val="center"/>
                   </w:pPr>
                   <w:r>
-                    <w:t xml:space="preserve">Panel comparativo por corpus</w:t>
+                    <w:t xml:space="preserve">Emociones NRC estandarizadas</w:t>
                   </w:r>
                 </w:p>
               </w:tc>
@@ -6858,7 +6905,7 @@
                     <w:jc w:val="center"/>
                   </w:pPr>
                   <w:r>
-                    <w:t xml:space="preserve">96</w:t>
+                    <w:t xml:space="preserve">80</w:t>
                   </w:r>
                 </w:p>
               </w:tc>
@@ -6871,7 +6918,7 @@
                     <w:jc w:val="center"/>
                   </w:pPr>
                   <w:r>
-                    <w:t xml:space="preserve">7</w:t>
+                    <w:t xml:space="preserve">1</w:t>
                   </w:r>
                 </w:p>
               </w:tc>
@@ -6897,7 +6944,39 @@
                     <w:jc w:val="center"/>
                   </w:pPr>
                   <w:r>
-                    <w:t xml:space="preserve">Polaridad presidencial → TRM, rezago 1: 0,00747; 0,475.</w:t>
+                    <w:t xml:space="preserve">Alegría (</w:t>
+                  </w:r>
+                  <m:oMath>
+                    <m:sSub>
+                      <m:e>
+                        <m:r>
+                          <m:t>z</m:t>
+                        </m:r>
+                      </m:e>
+                      <m:sub>
+                        <m:r>
+                          <m:rPr>
+                            <m:sty m:val="p"/>
+                          </m:rPr>
+                          <m:t>j</m:t>
+                        </m:r>
+                        <m:r>
+                          <m:rPr>
+                            <m:sty m:val="p"/>
+                          </m:rPr>
+                          <m:t>o</m:t>
+                        </m:r>
+                        <m:r>
+                          <m:rPr>
+                            <m:sty m:val="p"/>
+                          </m:rPr>
+                          <m:t>y</m:t>
+                        </m:r>
+                      </m:sub>
+                    </m:sSub>
+                  </m:oMath>
+                  <w:r>
+                    <w:t xml:space="preserve">) → TRM, rezago 2: 0,0466; 0,838.</w:t>
                   </w:r>
                 </w:p>
               </w:tc>
@@ -6912,11 +6991,7 @@
                     <w:jc w:val="center"/>
                   </w:pPr>
                   <w:r>
-                    <w:rPr>
-                      <w:b/>
-                      <w:bCs/>
-                    </w:rPr>
-                    <w:t xml:space="preserve">Total descriptivo</w:t>
+                    <w:t xml:space="preserve">Índice de Presión Informacional (IPI)</w:t>
                   </w:r>
                 </w:p>
               </w:tc>
@@ -6929,11 +7004,7 @@
                     <w:jc w:val="center"/>
                   </w:pPr>
                   <w:r>
-                    <w:rPr>
-                      <w:b/>
-                      <w:bCs/>
-                    </w:rPr>
-                    <w:t xml:space="preserve">208</w:t>
+                    <w:t xml:space="preserve">16</w:t>
                   </w:r>
                 </w:p>
               </w:tc>
@@ -6946,11 +7017,7 @@
                     <w:jc w:val="center"/>
                   </w:pPr>
                   <w:r>
-                    <w:rPr>
-                      <w:b/>
-                      <w:bCs/>
-                    </w:rPr>
-                    <w:t xml:space="preserve">12</w:t>
+                    <w:t xml:space="preserve">0</w:t>
                   </w:r>
                 </w:p>
               </w:tc>
@@ -6963,10 +7030,6 @@
                     <w:jc w:val="center"/>
                   </w:pPr>
                   <w:r>
-                    <w:rPr>
-                      <w:b/>
-                      <w:bCs/>
-                    </w:rPr>
                     <w:t xml:space="preserve">0</w:t>
                   </w:r>
                 </w:p>
@@ -6980,21 +7043,33 @@
                     <w:jc w:val="center"/>
                   </w:pPr>
                   <w:r>
-                    <w:t xml:space="preserve">Los valores</w:t>
-                  </w:r>
-                  <w:r>
-                    <w:t xml:space="preserve"> </w:t>
+                    <w:t xml:space="preserve">Sin rechazos nominales (</w:t>
                   </w:r>
                   <m:oMath>
                     <m:r>
-                      <m:t>q</m:t>
+                      <m:t>p</m:t>
+                    </m:r>
+                    <m:r>
+                      <m:rPr>
+                        <m:sty m:val="p"/>
+                      </m:rPr>
+                      <m:t>≥</m:t>
+                    </m:r>
+                    <m:r>
+                      <m:t>0</m:t>
+                    </m:r>
+                    <m:r>
+                      <m:rPr>
+                        <m:sty m:val="p"/>
+                      </m:rPr>
+                      <m:t>,</m:t>
+                    </m:r>
+                    <m:r>
+                      <m:t>0686</m:t>
                     </m:r>
                   </m:oMath>
                   <w:r>
-                    <w:t xml:space="preserve"> </w:t>
-                  </w:r>
-                  <w:r>
-                    <w:t xml:space="preserve">se calculan dentro de cada familia.</w:t>
+                    <w:t xml:space="preserve">).</w:t>
                   </w:r>
                 </w:p>
               </w:tc>
@@ -7010,37 +7085,7 @@
         <w:pStyle w:val="BodyText"/>
       </w:pPr>
       <w:r>
-        <w:t xml:space="preserve">La ausencia de rechazos ajustados delimita la evidencia en estas especificaciones diarias. Tampoco convierte los doce rechazos nominales en «falsos» individualmente: el procedimiento controla una tasa esperada bajo sus supuestos, no clasifica cada hipótesis como verdadera o espuria. Los resultados de</w:t>
-      </w:r>
-      <w:r>
-        <w:t xml:space="preserve"> </w:t>
-      </w:r>
-      <w:r>
-        <w:rPr>
-          <w:rStyle w:val="VerbatimChar"/>
-        </w:rPr>
-        <w:t xml:space="preserve">opinion</w:t>
-      </w:r>
-      <w:r>
-        <w:t xml:space="preserve"> </w:t>
-      </w:r>
-      <w:r>
-        <w:t xml:space="preserve">y</w:t>
-      </w:r>
-      <w:r>
-        <w:t xml:space="preserve"> </w:t>
-      </w:r>
-      <w:r>
-        <w:rPr>
-          <w:rStyle w:val="VerbatimChar"/>
-        </w:rPr>
-        <w:t xml:space="preserve">presidente</w:t>
-      </w:r>
-      <w:r>
-        <w:t xml:space="preserve"> </w:t>
-      </w:r>
-      <w:r>
-        <w:t xml:space="preserve">permanecen jerarquizados. La sensibilidad a los rezagos y la autocorrelación del VAR impiden presentar el ejercicio como una prueba definitiva de falta de relación económica.</w:t>
+        <w:t xml:space="preserve">La ausencia de rechazos ajustados delimita la evidencia en estas especificaciones diarias. Tampoco convierte los cinco rechazos nominales en «falsos» individualmente: el procedimiento controla una tasa esperada bajo sus supuestos, no clasifica cada hipótesis como verdadera o espuria. La sensibilidad a los rezagos y la autocorrelación del VAR impiden presentar el ejercicio como una prueba definitiva de falta de relación económica.</w:t>
       </w:r>
     </w:p>
     <w:p>
@@ -7926,7 +7971,7 @@
         <w:pStyle w:val="FirstParagraph"/>
       </w:pPr>
       <w:r>
-        <w:t xml:space="preserve">El tercer objetivo consistía en establecer disponibilidad y propiedades temporales. La diferencia entre 935 sesiones reales de COLCAP/TES y 1.400 días calendario demuestra por qué una tabla diaria con niveles propagados no equivale a una serie de rendimientos efectivos. La corrección del panel bursátil elimina 463 repeticiones espurias de la respuesta financiera, consolidando 934 sesiones únicas y una muestra completa de 882 observaciones para el sistema multivariado de seis variables. La reestimación sobre el universo presidencial confirma la estabilidad del VAR(1) (módulo de raíz máxima 0,281), pero ratifica la presencia de autocorrelación residual (</w:t>
+        <w:t xml:space="preserve">El tercer objetivo consistía en establecer disponibilidad y propiedades temporales. La diferencia entre 935 sesiones reales de COLCAP/TES y 1.400 días calendario demuestra por qué una tabla diaria con niveles propagados no equivale a una serie de rendimientos efectivos. La corrección del panel bursátil elimina 463 repeticiones espurias de la respuesta financiera, consolidando 934 sesiones únicas y una muestra completa de 882 observaciones para el sistema multivariado de seis variables (881 observaciones efectivas en el VAR). Los criterios de información difieren en el orden óptimo: HQ y SC/BIC favorecen un VAR(1), mientras AIC y FPE favorecen un VAR(3). Se conserva VAR(1) como especificación principal parsimoniosa y se evalúa VAR(3) como robustez; en ambas especificaciones las raíces dinámicas son estables (módulo máximo 0,281 en VAR(1)), pero se ratifica la presencia de autocorrelación residual (</w:t>
       </w:r>
       <m:oMath>
         <m:r>
@@ -8036,7 +8081,7 @@
         </m:r>
       </m:oMath>
       <w:r>
-        <w:t xml:space="preserve">). El IPI presidencial no presenta rechazos nominales frente a ningún activo financiero. En el panel comparativo por corpus, de 96 pruebas, siete son nominales (cinco presidenciales y dos de opinión) y cero superan FDR. Las correlaciones DCC estimadas entre señales presidenciales y mercados son descriptivamente pequeñas en promedio (-0,0430 a 0,0574); además, el parámetro de reacción a innovaciones discursivas (</w:t>
+        <w:t xml:space="preserve">). El IPI presidencial no presenta rechazos nominales frente a ningún activo financiero. Las correlaciones DCC estimadas entre señales presidenciales y mercados son descriptivamente pequeñas en promedio (-0,0430 a 0,0574); además, el parámetro de reacción a innovaciones discursivas (</w:t>
       </w:r>
       <m:oMath>
         <m:r>
@@ -8091,7 +8136,7 @@
         </m:r>
       </m:oMath>
       <w:r>
-        <w:t xml:space="preserve">) no se distingue de cero al 5 %. El modelo Markov-Switching discrimina dos regímenes de dispersión condicional IPI–TRM, reflejando cambios de estado en la covariación sin asignar causas exógenas. A la inversa, los movimientos del estudio de eventos alrededor de extremos presidenciales (-1,28 % TRM y +0,76 % COLCAP tras IPI extremo a siete días) no provienen de un diseño contrafactual y no permiten atribuir impacto causal a las publicaciones.</w:t>
+        <w:t xml:space="preserve">) no es significativo al 5 %. El modelo Markov-Switching discrimina dos regímenes estadísticos de dispersión condicional IPI–TRM, reflejando cambios de estado en la covariación sin asignar causas exógenas. A la inversa, los movimientos del estudio de eventos alrededor de extremos presidenciales (-1,28 % TRM y +0,76 % COLCAP tras IPI extremo a siete días calendario) no provienen de un diseño contrafactual y no permiten atribuir impacto causal a las publicaciones.</w:t>
       </w:r>
     </w:p>
     <w:p>
@@ -8133,7 +8178,7 @@
         <w:t xml:space="preserve">)</w:t>
       </w:r>
       <w:r>
-        <w:t xml:space="preserve">. Este artículo analiza datos diarios agregados observacionales en Colombia. La ausencia de rechazos ajustados no contradice necesariamente la literatura de microestructura financiera, pero descarta que los mensajes presidenciales generen perturbaciones sistemáticas detectables en la escala diaria de negociación.</w:t>
+        <w:t xml:space="preserve">. Este artículo analiza datos diarios agregados observacionales en Colombia. La ausencia de rechazos ajustados no contradice necesariamente la literatura de microestructura financiera, pero evidencia que no se observa contenido predictivo sistemático bajo las especificaciones diarias analizadas.</w:t>
       </w:r>
     </w:p>
     <w:p>
@@ -8322,7 +8367,7 @@
         </m:r>
       </m:oMath>
       <w:r>
-        <w:t xml:space="preserve">); (3) se implementó una alineación temporal libre de retornos duplicados, consolidando 934 sesiones únicas y 882 observaciones completas para el sistema econométrico multivariado; y (4) se contrastó la precedencia predictiva y la correlación condicional dinámica.</w:t>
+        <w:t xml:space="preserve">); (3) se implementó una alineación temporal libre de retornos duplicados, consolidando 934 sesiones únicas, 882 observaciones completas para el sistema econométrico multivariado y 881 observaciones en el VAR; y (4) se contrastó la precedencia predictiva y la correlación condicional dinámica.</w:t>
       </w:r>
     </w:p>
     <w:p>
@@ -8330,46 +8375,7 @@
         <w:pStyle w:val="BodyText"/>
       </w:pPr>
       <w:r>
-        <w:t xml:space="preserve">Los resultados empíricos son concluyentes dentro de la frecuencia observada:</w:t>
-      </w:r>
-      <w:r>
-        <w:t xml:space="preserve"> </w:t>
-      </w:r>
-      <w:r>
-        <w:rPr>
-          <w:b/>
-          <w:bCs/>
-        </w:rPr>
-        <w:t xml:space="preserve">no se encuentra evidencia de precedencia predictiva lineal robusta ni de transmisión sistemática de volatilidad desde la cuenta presidencial hacia los mercados financieros colombianos</w:t>
-      </w:r>
-      <w:r>
-        <w:t xml:space="preserve">. Ninguna prueba de Granger sobrevive al control FDR de comparaciones múltiples (cero de 208 pruebas en las dos familias auditadas), el parámetro de reacción del DCC-GARCH no es significativo (</w:t>
-      </w:r>
-      <m:oMath>
-        <m:r>
-          <m:t>p</m:t>
-        </m:r>
-        <m:r>
-          <m:rPr>
-            <m:sty m:val="p"/>
-          </m:rPr>
-          <m:t>=</m:t>
-        </m:r>
-        <m:r>
-          <m:t>0</m:t>
-        </m:r>
-        <m:r>
-          <m:rPr>
-            <m:sty m:val="p"/>
-          </m:rPr>
-          <m:t>,</m:t>
-        </m:r>
-        <m:r>
-          <m:t>069</m:t>
-        </m:r>
-      </m:oMath>
-      <w:r>
-        <w:t xml:space="preserve">) y las correlaciones condicionales dinámicas son descriptivamente pequeñas. Estos hallazgos descartan que las publicaciones diarias del mandatario generen impactos económicos sistemáticos observables en la TRM, COLCAP o tasas TES bajo un diseño observacional diario.</w:t>
+        <w:t xml:space="preserve">Las especificaciones diarias analizadas no muestran evidencia robusta de contenido predictivo lineal sistemático de la comunicación presidencial sobre los mercados financieros considerados. Aunque algunas pruebas nominales vinculan la polaridad presidencial con la TRM, ninguna sobrevive al control de comparaciones múltiples (cero rechazos tras ajuste FDR de Benjamini-Hochberg en las 112 pruebas de la familia presidencial). El IPI presidencial no presenta precedencia nominal frente a los activos estudiados y las correlaciones condicionales DCC son pequeñas en promedio. Estos resultados se limitan a la frecuencia, variables y modelos analizados y no identifican efectos causales.</w:t>
       </w:r>
     </w:p>
     <w:bookmarkEnd w:id="72"/>

</xml_diff>